<commit_message>
docs: generate high-res ER diagram image and embed into report
</commit_message>
<xml_diff>
--- a/SSKRU_Campus_Map_Report.docx
+++ b/SSKRU_Campus_Map_Report.docx
@@ -177,58 +177,61 @@
         <w:ind w:firstLine="720"/>
       </w:pPr>
       <w:r>
-        <w:t>โครงสร้างฐานข้อมูลของระบบประกอบด้วย 8 Entity หลัก โดยมีความสัมพันธ์แบบ 1 ต่อ กลุ่ม (1:N) ระหว่างข้อมูลผู้เยี่ยมชมและประวัติกิจกรรมการใช้งาน ดังนี้:</w:t>
+        <w:t>โครงสร้างฐานข้อมูลของระบบประกอบด้วย 8 Entity หลัก โดยมีความสัมพันธ์แบบ 1 ต่อ กลุ่ม (1:N) ระหว่างข้อมูลผู้เยี่ยมชมและประวัติกิจกรรมการใช้งาน ดังแสดงในแผนผัง ER-Diagram ด้านล่างนี้:</w:t>
       </w:r>
     </w:p>
     <w:p>
       <w:pPr>
-        <w:ind w:left="432"/>
+        <w:jc w:val="center"/>
+      </w:pPr>
+    </w:p>
+    <w:p>
+      <w:r>
+        <w:drawing>
+          <wp:inline xmlns:a="http://schemas.openxmlformats.org/drawingml/2006/main" xmlns:pic="http://schemas.openxmlformats.org/drawingml/2006/picture">
+            <wp:extent cx="5669280" cy="3675061"/>
+            <wp:docPr id="1" name="Picture 1"/>
+            <wp:cNvGraphicFramePr>
+              <a:graphicFrameLocks noChangeAspect="1"/>
+            </wp:cNvGraphicFramePr>
+            <a:graphic>
+              <a:graphicData uri="http://schemas.openxmlformats.org/drawingml/2006/picture">
+                <pic:pic>
+                  <pic:nvPicPr>
+                    <pic:cNvPr id="0" name="er_diagram_hd.png"/>
+                    <pic:cNvPicPr/>
+                  </pic:nvPicPr>
+                  <pic:blipFill>
+                    <a:blip r:embed="rId9"/>
+                    <a:stretch>
+                      <a:fillRect/>
+                    </a:stretch>
+                  </pic:blipFill>
+                  <pic:spPr>
+                    <a:xfrm>
+                      <a:off x="0" y="0"/>
+                      <a:ext cx="5669280" cy="3675061"/>
+                    </a:xfrm>
+                    <a:prstGeom prst="rect"/>
+                  </pic:spPr>
+                </pic:pic>
+              </a:graphicData>
+            </a:graphic>
+          </wp:inline>
+        </w:drawing>
+      </w:r>
+    </w:p>
+    <w:p>
+      <w:pPr>
+        <w:jc w:val="center"/>
       </w:pPr>
       <w:r>
         <w:rPr>
-          <w:rFonts w:ascii="Courier New" w:hAnsi="Courier New"/>
-          <w:sz w:val="22"/>
+          <w:i/>
+          <w:color w:val="64748B"/>
+          <w:sz w:val="26"/>
         </w:rPr>
-        <w:t>┌──────────────────────┐         1:N          ┌──────────────────────┐</w:t>
-        <w:br/>
-        <w:t>│     VISITOR_LOG      │ ───────────────────&lt; │      USER_EVENT      │</w:t>
-        <w:br/>
-        <w:t>│  PK: id              │                      │  PK: id              │</w:t>
-        <w:br/>
-        <w:t>│  session_id, ip      │                      │  FK: visitor_id      │</w:t>
-        <w:br/>
-        <w:t>└──────────────────────┘                      │  event_type, data    │</w:t>
-        <w:br/>
-        <w:t xml:space="preserve">                                              └──────────────────────┘</w:t>
-        <w:br/>
-        <w:t>┌──────────────────────┐                      ┌──────────────────────┐</w:t>
-        <w:br/>
-        <w:t>│       STUDENT        │                      │      STAFF_USER      │</w:t>
-        <w:br/>
-        <w:t>│  PK: id              │                      │  PK: id              │</w:t>
-        <w:br/>
-        <w:t>│  UK: student_id      │                      │  UK: username, email │</w:t>
-        <w:br/>
-        <w:t>└──────────────────────┘                      └──────────────────────┘</w:t>
-        <w:br/>
-        <w:t>┌──────────────────────┐                      ┌──────────────────────┐</w:t>
-        <w:br/>
-        <w:t>│       BUILDING       │                      │  USER_ACTIVITY_LOG   │</w:t>
-        <w:br/>
-        <w:t>│  PK: id              │                      │  PK: id              │</w:t>
-        <w:br/>
-        <w:t>│  UK: building_id     │                      │  user_id, role, ip   │</w:t>
-        <w:br/>
-        <w:t>└──────────────────────┘                      └──────────────────────┘</w:t>
-        <w:br/>
-        <w:t>┌──────────────────────┐                      ┌──────────────────────┐</w:t>
-        <w:br/>
-        <w:t>│ PASSWORD_RESET_TOKEN │                      │    ADMIN_SESSION     │</w:t>
-        <w:br/>
-        <w:t>│  PK: id, UK: token   │                      │  PK: id, UK: token   │</w:t>
-        <w:br/>
-        <w:t>└──────────────────────┘                      └──────────────────────┘</w:t>
-        <w:br/>
+        <w:t>รูปที่ 2.1: ผังแสดงความสัมพันธ์ของข้อมูล (Entity-Relationship Diagram)</w:t>
       </w:r>
     </w:p>
     <w:p>

</xml_diff>

<commit_message>
docs: regenerate high precision ER-Diagram with sharp fonts, clear relationships, and embed into Pages report
</commit_message>
<xml_diff>
--- a/SSKRU_Campus_Map_Report.docx
+++ b/SSKRU_Campus_Map_Report.docx
@@ -302,7 +302,7 @@
       <w:r>
         <w:drawing>
           <wp:inline xmlns:a="http://schemas.openxmlformats.org/drawingml/2006/main" xmlns:pic="http://schemas.openxmlformats.org/drawingml/2006/picture">
-            <wp:extent cx="5852160" cy="3793611"/>
+            <wp:extent cx="5852160" cy="3648418"/>
             <wp:docPr id="1" name="Picture 1"/>
             <wp:cNvGraphicFramePr>
               <a:graphicFrameLocks noChangeAspect="1"/>
@@ -323,7 +323,7 @@
                   <pic:spPr>
                     <a:xfrm>
                       <a:off x="0" y="0"/>
-                      <a:ext cx="5852160" cy="3793611"/>
+                      <a:ext cx="5852160" cy="3648418"/>
                     </a:xfrm>
                     <a:prstGeom prst="rect"/>
                   </pic:spPr>

</xml_diff>

<commit_message>
docs: complete ER-Diagram with 9 fully interconnected relationships and clean Crow's foot notation
</commit_message>
<xml_diff>
--- a/SSKRU_Campus_Map_Report.docx
+++ b/SSKRU_Campus_Map_Report.docx
@@ -302,7 +302,7 @@
       <w:r>
         <w:drawing>
           <wp:inline xmlns:a="http://schemas.openxmlformats.org/drawingml/2006/main" xmlns:pic="http://schemas.openxmlformats.org/drawingml/2006/picture">
-            <wp:extent cx="5852160" cy="3648418"/>
+            <wp:extent cx="5852160" cy="3592639"/>
             <wp:docPr id="1" name="Picture 1"/>
             <wp:cNvGraphicFramePr>
               <a:graphicFrameLocks noChangeAspect="1"/>
@@ -323,7 +323,7 @@
                   <pic:spPr>
                     <a:xfrm>
                       <a:off x="0" y="0"/>
-                      <a:ext cx="5852160" cy="3648418"/>
+                      <a:ext cx="5852160" cy="3592639"/>
                     </a:xfrm>
                     <a:prstGeom prst="rect"/>
                   </pic:spPr>

</xml_diff>